<commit_message>
Anu 1 bakylau 2 nuska
</commit_message>
<xml_diff>
--- a/Docker otchet.docx
+++ b/Docker otchet.docx
@@ -37,7 +37,8 @@
       </w:pPr>
       <w:r>
         <w:rPr>
-          <w:lang w:val="en-US"/>
+          <w:noProof/>
+          <w:lang w:val="ru-RU" w:eastAsia="ru-RU"/>
         </w:rPr>
         <w:drawing>
           <wp:inline distT="0" distB="0" distL="0" distR="0" wp14:anchorId="117B3DD4" wp14:editId="4FB1D01D">
@@ -96,7 +97,8 @@
       </w:r>
       <w:r>
         <w:rPr>
-          <w:lang w:val="en-US"/>
+          <w:noProof/>
+          <w:lang w:val="ru-RU" w:eastAsia="ru-RU"/>
         </w:rPr>
         <w:drawing>
           <wp:inline distT="0" distB="0" distL="0" distR="0" wp14:anchorId="3DAB8DAA" wp14:editId="6ECD9402">
@@ -123,6 +125,80 @@
                     <a:xfrm>
                       <a:off x="0" y="0"/>
                       <a:ext cx="4839375" cy="1771897"/>
+                    </a:xfrm>
+                    <a:prstGeom prst="rect">
+                      <a:avLst/>
+                    </a:prstGeom>
+                  </pic:spPr>
+                </pic:pic>
+              </a:graphicData>
+            </a:graphic>
+          </wp:inline>
+        </w:drawing>
+      </w:r>
+    </w:p>
+    <w:p>
+      <w:pPr>
+        <w:rPr>
+          <w:lang w:val="en-US"/>
+        </w:rPr>
+      </w:pPr>
+      <w:r>
+        <w:rPr>
+          <w:lang w:val="en-US"/>
+        </w:rPr>
+        <w:t xml:space="preserve">Docker </w:t>
+      </w:r>
+      <w:proofErr w:type="spellStart"/>
+      <w:r>
+        <w:rPr>
+          <w:lang w:val="en-US"/>
+        </w:rPr>
+        <w:t>ps</w:t>
+      </w:r>
+      <w:proofErr w:type="spellEnd"/>
+      <w:r>
+        <w:rPr>
+          <w:lang w:val="en-US"/>
+        </w:rPr>
+        <w:t xml:space="preserve"> –a </w:t>
+      </w:r>
+    </w:p>
+    <w:p>
+      <w:pPr>
+        <w:rPr>
+          <w:lang w:val="en-US"/>
+        </w:rPr>
+      </w:pPr>
+      <w:r>
+        <w:rPr>
+          <w:lang w:val="en-US"/>
+        </w:rPr>
+        <w:drawing>
+          <wp:inline distT="0" distB="0" distL="0" distR="0" wp14:anchorId="71B63E81" wp14:editId="670EEDC3">
+            <wp:extent cx="5940425" cy="2482850"/>
+            <wp:effectExtent l="0" t="0" r="3175" b="0"/>
+            <wp:docPr id="3" name="Рисунок 3"/>
+            <wp:cNvGraphicFramePr>
+              <a:graphicFrameLocks xmlns:a="http://schemas.openxmlformats.org/drawingml/2006/main" noChangeAspect="1"/>
+            </wp:cNvGraphicFramePr>
+            <a:graphic xmlns:a="http://schemas.openxmlformats.org/drawingml/2006/main">
+              <a:graphicData uri="http://schemas.openxmlformats.org/drawingml/2006/picture">
+                <pic:pic xmlns:pic="http://schemas.openxmlformats.org/drawingml/2006/picture">
+                  <pic:nvPicPr>
+                    <pic:cNvPr id="1" name=""/>
+                    <pic:cNvPicPr/>
+                  </pic:nvPicPr>
+                  <pic:blipFill>
+                    <a:blip r:embed="rId6"/>
+                    <a:stretch>
+                      <a:fillRect/>
+                    </a:stretch>
+                  </pic:blipFill>
+                  <pic:spPr>
+                    <a:xfrm>
+                      <a:off x="0" y="0"/>
+                      <a:ext cx="5940425" cy="2482850"/>
                     </a:xfrm>
                     <a:prstGeom prst="rect">
                       <a:avLst/>

</xml_diff>